<commit_message>
LendingTree Senior CRM Campaign Specialist: score 84 with Solenzo email results (880K+ delivered, ~43% open, 0.01% spam); metrics added to profile; salary $105K
Co-Authored-By: Claude Opus 5.5 <noreply@anthropic.com>
Claude-Session: https://claude.ai/code/session_018DEej5NGjq1omj9BTtvEiy
</commit_message>
<xml_diff>
--- a/applications/lendingtree-senior-crm-campaign-specialist/LendingTree-SeniorCRMCampaignSpecialist-Resume.docx
+++ b/applications/lendingtree-senior-crm-campaign-specialist/LendingTree-SeniorCRMCampaignSpecialist-Resume.docx
@@ -80,7 +80,7 @@
           <w:i w:val="0"/>
           <w:color w:val="1A1A1A"/>
         </w:rPr>
-        <w:t>Lifecycle and CRM marketer who builds and runs email programs end to end. At Solenzo I design, build, and optimize automated lifecycle journeys for consumer-facing service businesses: onboarding, nurture, booking reminders, no-show recovery, reactivation of lapsed customers, and review requests across 20+ production workflows, with segmentation, lifecycle stages, and lead scoring in GoHighLevel and HubSpot. At Level Agency I built complex email sequences and landing pages for accounts spending $20K+/month on ads, ran A/B tests, and reported ROI, CAC, and conversion KPIs.</w:t>
+        <w:t>Lifecycle and CRM marketer who builds and runs email programs end to end: 880K+ emails delivered over ~18 months at a ~43% open rate, ~11% click rate, and 0.01% spam complaint rate. At Solenzo I design, build, and optimize automated lifecycle journeys for consumer-facing service businesses: onboarding, nurture, booking reminders, no-show recovery, reactivation of lapsed customers, and review requests across 20+ production workflows, with segmentation, lifecycle stages, and lead scoring in GoHighLevel and HubSpot. At Level Agency I built complex email sequences and landing pages for accounts spending $20K+/month on ads, ran A/B tests, and reported ROI, CAC, and conversion KPIs.</w:t>
       </w:r>
     </w:p>
     <w:p>
@@ -177,6 +177,30 @@
           <w:i w:val="0"/>
           <w:color w:val="1A1A1A"/>
         </w:rPr>
+        <w:t>Ran email programs in GoHighLevel delivering 880K+ emails over ~18 months at a ~43% open rate, ~11% click rate, ~1.4% bounce rate, and 0.01% spam complaint rate, across campaigns, automated workflows, and bulk sends.</w:t>
+      </w:r>
+    </w:p>
+    <w:p>
+      <w:pPr>
+        <w:spacing w:after="30"/>
+        <w:ind w:left="259" w:hanging="259"/>
+      </w:pPr>
+      <w:r>
+        <w:rPr>
+          <w:rFonts w:ascii="Calibri" w:hAnsi="Calibri"/>
+          <w:b w:val="0"/>
+          <w:i w:val="0"/>
+          <w:color w:val="163A5F"/>
+        </w:rPr>
+        <w:t xml:space="preserve">•  </w:t>
+      </w:r>
+      <w:r>
+        <w:rPr>
+          <w:rFonts w:ascii="Calibri" w:hAnsi="Calibri"/>
+          <w:b w:val="0"/>
+          <w:i w:val="0"/>
+          <w:color w:val="1A1A1A"/>
+        </w:rPr>
         <w:t>Design and deploy automated lifecycle email journeys that activate, nurture, and retain customers, including onboarding, booking confirmations and reminders, no-show recovery, reactivation of lapsed customers, and review requests.</w:t>
       </w:r>
     </w:p>
@@ -202,30 +226,6 @@
           <w:color w:val="1A1A1A"/>
         </w:rPr>
         <w:t>Build segmentation, lifecycle stages, lead scoring, and qualification criteria in GoHighLevel and HubSpot, with strict data-hygiene rules so personalization holds up.</w:t>
-      </w:r>
-    </w:p>
-    <w:p>
-      <w:pPr>
-        <w:spacing w:after="30"/>
-        <w:ind w:left="259" w:hanging="259"/>
-      </w:pPr>
-      <w:r>
-        <w:rPr>
-          <w:rFonts w:ascii="Calibri" w:hAnsi="Calibri"/>
-          <w:b w:val="0"/>
-          <w:i w:val="0"/>
-          <w:color w:val="163A5F"/>
-        </w:rPr>
-        <w:t xml:space="preserve">•  </w:t>
-      </w:r>
-      <w:r>
-        <w:rPr>
-          <w:rFonts w:ascii="Calibri" w:hAnsi="Calibri"/>
-          <w:b w:val="0"/>
-          <w:i w:val="0"/>
-          <w:color w:val="1A1A1A"/>
-        </w:rPr>
-        <w:t>Built segmented outreach campaigns tailored to each audience's specific problem, plus an automated audit workflow that enrolled 180+ contacts and triggered personalized follow-up.</w:t>
       </w:r>
     </w:p>
     <w:p>

</xml_diff>